<commit_message>
home... schreiben probanten test
</commit_message>
<xml_diff>
--- a/mails mit den betreuern.docx
+++ b/mails mit den betreuern.docx
@@ -24,7 +24,15 @@
     </w:p>
     <w:p>
       <w:r>
-        <w:t>Um die Wahrscheinlichkeit zu erhöhen, dass das mit der Zulassung zum 1. Juni klappt, wäre es wichtig, dass die Anmeldung aber jetzt trotzdem passiert.</w:t>
+        <w:t xml:space="preserve">Um die Wahrscheinlichkeit zu erhöhen, dass das mit der Zulassung zum 1. Juni </w:t>
+      </w:r>
+      <w:proofErr w:type="gramStart"/>
+      <w:r>
+        <w:t>klappt</w:t>
+      </w:r>
+      <w:proofErr w:type="gramEnd"/>
+      <w:r>
+        <w:t>, wäre es wichtig, dass die Anmeldung aber jetzt trotzdem passiert.</w:t>
       </w:r>
     </w:p>
     <w:p>
@@ -56,7 +64,23 @@
         </w:r>
       </w:hyperlink>
       <w:r>
-        <w:t>) und dem Exposé bei und sende alles an das Dekanat. Wenn ja, dann sende nur Anlage 1 und Exposé ans Dekanat. Laut Prozessbeschreibung (</w:t>
+        <w:t xml:space="preserve">) und dem </w:t>
+      </w:r>
+      <w:proofErr w:type="gramStart"/>
+      <w:r>
+        <w:t>Exposé</w:t>
+      </w:r>
+      <w:proofErr w:type="gramEnd"/>
+      <w:r>
+        <w:t xml:space="preserve"> bei und sende alles an das Dekanat. Wenn ja, dann sende nur Anlage 1 und </w:t>
+      </w:r>
+      <w:proofErr w:type="gramStart"/>
+      <w:r>
+        <w:t>Exposé</w:t>
+      </w:r>
+      <w:proofErr w:type="gramEnd"/>
+      <w:r>
+        <w:t xml:space="preserve"> ans Dekanat. Laut Prozessbeschreibung (</w:t>
       </w:r>
       <w:hyperlink r:id="rId6" w:history="1">
         <w:r>
@@ -67,27 +91,51 @@
         </w:r>
       </w:hyperlink>
       <w:r>
-        <w:t>) werden Anträge zwar nur zum 1. Juni wieder bearbeitet, aber ich denke, mit dem Vorlauf klappt es auch so.</w:t>
-      </w:r>
-    </w:p>
-    <w:p>
-      <w:r>
-        <w:t> </w:t>
-      </w:r>
-    </w:p>
-    <w:p>
-      <w:r>
-        <w:t xml:space="preserve">Vorher Anlage 1 in jedem Fall bitte an mich zur Unterschrift. Und im Exposé sollte der Titel noch auftauchen. Ich schlage vor: „Kamerabasierte Gestenerkennung zur Steuerung eines virtuellen Orchesters“. Im Notfall können wir ihn auch später nochmal leicht anpassen. </w:t>
-      </w:r>
-    </w:p>
-    <w:p>
-      <w:r>
-        <w:t> </w:t>
-      </w:r>
-    </w:p>
-    <w:p>
-      <w:r>
-        <w:t xml:space="preserve">Bei der Recherche solltest Du nach Gestenerkennung solltest Du darauf achten, dass die Vergleichsarbeiten möglichst nah an unser Zielsystem herankommen, d.h. es sollte auch nicht nur um Finger-/Handstellungen gehen sondern auch um bspw. Armbewegungen. Als Datenbanken empfehle ich IEEE </w:t>
+        <w:t xml:space="preserve">) werden Anträge zwar nur zum 1. Juni wieder bearbeitet, aber ich denke, mit dem Vorlauf </w:t>
+      </w:r>
+      <w:proofErr w:type="gramStart"/>
+      <w:r>
+        <w:t>klappt</w:t>
+      </w:r>
+      <w:proofErr w:type="gramEnd"/>
+      <w:r>
+        <w:t xml:space="preserve"> es auch so.</w:t>
+      </w:r>
+    </w:p>
+    <w:p>
+      <w:r>
+        <w:t> </w:t>
+      </w:r>
+    </w:p>
+    <w:p>
+      <w:r>
+        <w:t xml:space="preserve">Vorher Anlage 1 in jedem Fall bitte an mich zur Unterschrift. Und im </w:t>
+      </w:r>
+      <w:proofErr w:type="gramStart"/>
+      <w:r>
+        <w:t>Exposé</w:t>
+      </w:r>
+      <w:proofErr w:type="gramEnd"/>
+      <w:r>
+        <w:t xml:space="preserve"> sollte der Titel noch auftauchen. Ich schlage vor: „Kamerabasierte Gestenerkennung zur Steuerung eines virtuellen Orchesters“. Im Notfall können wir ihn auch später nochmal leicht anpassen. </w:t>
+      </w:r>
+    </w:p>
+    <w:p>
+      <w:r>
+        <w:t> </w:t>
+      </w:r>
+    </w:p>
+    <w:p>
+      <w:r>
+        <w:t xml:space="preserve">Bei der Recherche solltest Du nach Gestenerkennung solltest Du darauf achten, dass die Vergleichsarbeiten möglichst nah an unser Zielsystem herankommen, d.h. es sollte auch nicht nur um Finger-/Handstellungen </w:t>
+      </w:r>
+      <w:proofErr w:type="gramStart"/>
+      <w:r>
+        <w:t>gehen</w:t>
+      </w:r>
+      <w:proofErr w:type="gramEnd"/>
+      <w:r>
+        <w:t xml:space="preserve"> sondern auch um bspw. Armbewegungen. Als Datenbanken empfehle ich IEEE </w:t>
       </w:r>
       <w:proofErr w:type="spellStart"/>
       <w:r>
@@ -170,12 +218,21 @@
       <w:r>
         <w:br/>
       </w:r>
+      <w:proofErr w:type="gramStart"/>
       <w:r>
         <w:rPr>
           <w:b/>
           <w:bCs/>
         </w:rPr>
-        <w:t>Gesendet:</w:t>
+        <w:t>Gesendet</w:t>
+      </w:r>
+      <w:proofErr w:type="gramEnd"/>
+      <w:r>
+        <w:rPr>
+          <w:b/>
+          <w:bCs/>
+        </w:rPr>
+        <w:t>:</w:t>
       </w:r>
       <w:r>
         <w:t xml:space="preserve"> Freitag, 13. März 2026 13:38</w:t>
@@ -248,17 +305,27 @@
         <w:t xml:space="preserve">Ich denke, </w:t>
       </w:r>
       <w:proofErr w:type="spellStart"/>
+      <w:proofErr w:type="gramStart"/>
       <w:r>
         <w:t>das</w:t>
       </w:r>
       <w:proofErr w:type="spellEnd"/>
+      <w:proofErr w:type="gramEnd"/>
       <w:r>
         <w:t xml:space="preserve"> ich es nicht eilig habe, kenne die anmelde Fristen aber nicht genau.</w:t>
       </w:r>
     </w:p>
     <w:p>
       <w:r>
-        <w:t xml:space="preserve">Am 30.April endet meine Arbeit am IZM wenn ich dann den Mai als zusätzliche Vorlauf habe und </w:t>
+        <w:t xml:space="preserve">Am 30.April endet meine Arbeit am </w:t>
+      </w:r>
+      <w:proofErr w:type="gramStart"/>
+      <w:r>
+        <w:t>IZM</w:t>
+      </w:r>
+      <w:proofErr w:type="gramEnd"/>
+      <w:r>
+        <w:t xml:space="preserve"> wenn ich dann den Mai als zusätzliche Vorlauf habe und </w:t>
       </w:r>
       <w:r>
         <w:rPr>
@@ -288,7 +355,15 @@
     </w:p>
     <w:p>
       <w:r>
-        <w:t>Ich werde mir auch jetzt schon probieren jede Woche mindestens einen Tag für die Arbeit frei zu halten und wie André meinte, schon mal recherchieren (etwas üben, denn darin bin ich nicht so gut, denke ich) </w:t>
+        <w:t xml:space="preserve">Ich werde mir auch jetzt schon probieren jede Woche mindestens einen Tag für die Arbeit </w:t>
+      </w:r>
+      <w:proofErr w:type="gramStart"/>
+      <w:r>
+        <w:t>frei zu halten</w:t>
+      </w:r>
+      <w:proofErr w:type="gramEnd"/>
+      <w:r>
+        <w:t xml:space="preserve"> und wie André meinte, schon mal recherchieren (etwas üben, denn darin bin ich nicht so gut, denke ich) </w:t>
       </w:r>
     </w:p>
     <w:p>
@@ -301,10 +376,12 @@
         <w:t xml:space="preserve">@Marcus, ich wünsche dir alles </w:t>
       </w:r>
       <w:proofErr w:type="spellStart"/>
+      <w:proofErr w:type="gramStart"/>
       <w:r>
         <w:t>gute</w:t>
       </w:r>
       <w:proofErr w:type="spellEnd"/>
+      <w:proofErr w:type="gramEnd"/>
       <w:r>
         <w:t xml:space="preserve"> mit deiner Mutter!</w:t>
       </w:r>
@@ -415,7 +492,15 @@
     </w:p>
     <w:p>
       <w:r>
-        <w:t>das Exposé wäre für mich jetzt erstmal ok so.</w:t>
+        <w:t xml:space="preserve">das </w:t>
+      </w:r>
+      <w:proofErr w:type="gramStart"/>
+      <w:r>
+        <w:t>Exposé</w:t>
+      </w:r>
+      <w:proofErr w:type="gramEnd"/>
+      <w:r>
+        <w:t xml:space="preserve"> wäre für mich jetzt erstmal ok so.</w:t>
       </w:r>
     </w:p>
     <w:p>
@@ -544,7 +629,15 @@
     </w:p>
     <w:p>
       <w:r>
-        <w:t>Gerne können wir und Live oder per Video treffen. ich bin Flexibel und kann stand jetzt noch jeden Tag, Dienstag und Mittwoch aber erst ab</w:t>
+        <w:t xml:space="preserve">Gerne können wir und Live oder per Video treffen. ich bin </w:t>
+      </w:r>
+      <w:proofErr w:type="gramStart"/>
+      <w:r>
+        <w:t>Flexibel</w:t>
+      </w:r>
+      <w:proofErr w:type="gramEnd"/>
+      <w:r>
+        <w:t xml:space="preserve"> und kann stand jetzt noch jeden Tag, Dienstag und Mittwoch aber erst ab</w:t>
       </w:r>
     </w:p>
     <w:p>
@@ -554,7 +647,15 @@
     </w:p>
     <w:p>
       <w:r>
-        <w:t>In jedem Fall habe ich hier schon einmal eigenständig probiert das Exposé anzupassen (im Anhang), können wir aber auch dann zusammen durchgehen.</w:t>
+        <w:t xml:space="preserve">In jedem Fall habe ich hier schon einmal eigenständig probiert das </w:t>
+      </w:r>
+      <w:proofErr w:type="gramStart"/>
+      <w:r>
+        <w:t>Exposé</w:t>
+      </w:r>
+      <w:proofErr w:type="gramEnd"/>
+      <w:r>
+        <w:t xml:space="preserve"> anzupassen (im Anhang), können wir aber auch dann zusammen durchgehen.</w:t>
       </w:r>
     </w:p>
     <w:p>
@@ -661,8 +762,13 @@
     </w:p>
     <w:p>
       <w:r>
-        <w:t>für mich gemeint. Oder sollte ich dementsprechend auch das Exposé</w:t>
-      </w:r>
+        <w:t xml:space="preserve">für mich gemeint. Oder sollte ich dementsprechend auch das </w:t>
+      </w:r>
+      <w:proofErr w:type="gramStart"/>
+      <w:r>
+        <w:t>Exposé</w:t>
+      </w:r>
+      <w:proofErr w:type="gramEnd"/>
     </w:p>
     <w:p>
       <w:r>
@@ -682,7 +788,39 @@
     <w:p/>
     <w:p>
       <w:r>
-        <w:t>ich denke auch, Du hast in dem Exposé die Zielstellung prinzipiell richtig erfasst. Manche Aspekte würde ich allerdings aus dem Exposé rauslassen. Das Exposé (für die Anmeldung der Arbeit) soll nur die Themenstellung definieren. Es ist aber gut, dass Du schon viele andere Dinge angesprochen hast, die wir nun diskutieren können.</w:t>
+        <w:t xml:space="preserve">ich denke auch, Du hast in dem </w:t>
+      </w:r>
+      <w:proofErr w:type="gramStart"/>
+      <w:r>
+        <w:t>Exposé</w:t>
+      </w:r>
+      <w:proofErr w:type="gramEnd"/>
+      <w:r>
+        <w:t xml:space="preserve"> die </w:t>
+      </w:r>
+      <w:proofErr w:type="gramStart"/>
+      <w:r>
+        <w:t>Zielstellung prinzipiell</w:t>
+      </w:r>
+      <w:proofErr w:type="gramEnd"/>
+      <w:r>
+        <w:t xml:space="preserve"> richtig erfasst. Manche Aspekte würde ich allerdings aus dem </w:t>
+      </w:r>
+      <w:proofErr w:type="gramStart"/>
+      <w:r>
+        <w:t>Exposé</w:t>
+      </w:r>
+      <w:proofErr w:type="gramEnd"/>
+      <w:r>
+        <w:t xml:space="preserve"> rauslassen. Das </w:t>
+      </w:r>
+      <w:proofErr w:type="gramStart"/>
+      <w:r>
+        <w:t>Exposé</w:t>
+      </w:r>
+      <w:proofErr w:type="gramEnd"/>
+      <w:r>
+        <w:t xml:space="preserve"> (für die Anmeldung der Arbeit) soll nur die Themenstellung definieren. Es ist aber gut, dass Du schon viele andere Dinge angesprochen hast, die wir nun diskutieren können.</w:t>
       </w:r>
     </w:p>
     <w:p/>
@@ -694,7 +832,15 @@
     <w:p/>
     <w:p>
       <w:r>
-        <w:t>1. Erkennung zu definierender Gesten/Bewegungen zur Auswahl und Verschiebung der Instrumente (Gestenerkennung)</w:t>
+        <w:t xml:space="preserve">1. Erkennung </w:t>
+      </w:r>
+      <w:proofErr w:type="gramStart"/>
+      <w:r>
+        <w:t>zu definierender Gesten</w:t>
+      </w:r>
+      <w:proofErr w:type="gramEnd"/>
+      <w:r>
+        <w:t>/Bewegungen zur Auswahl und Verschiebung der Instrumente (Gestenerkennung)</w:t>
       </w:r>
     </w:p>
     <w:p>
@@ -729,7 +875,15 @@
     </w:p>
     <w:p>
       <w:r>
-        <w:t>- Du sprichst von Gesten, und Dein Beispielbild zeigt auch eine Handskelett, was man für eine Handgestenerkennung nutzen kann. Sicherlich ist es möglich, mit den Gesten (Daumen links / rechts) auch die Bewegungssteuerung durchzuführen, aber das halte ich für unkomfortabel für den Benutzer. Da könnte ich mir eher vorstellen, so wie Du es unter Pkt. 7 beschreibst, dass man durch eine Armbewegung das Instrument verschiebt, d.h. z.B. genau dahin zeigt, wo das Instrument hinsoll. Inwieweit dies über klassische Bildverarbeitung (z.B. farbige Handschuhe und Tracking der Farbe) oder über ein KI-Modell erfolgt, würde ich zunächst offen lassen. Ich denke, es ist wichtig, wenn Du dazu noch recherchierst. Insofern würde ich noch nicht unbedingt auf Mediapipe setzen, zumal dies auch von der Plattform für das Videosystem abhängen wird. Auf der von Dir genannten Nvidia-Jetson Plattform hatten wir damit Probleme, aber auch das wäre zu evaluieren. Vielleicht ist die Unterstützung da inzwischen besser.</w:t>
+        <w:t xml:space="preserve">- Du sprichst von Gesten, und Dein Beispielbild zeigt auch eine Handskelett, was man für eine Handgestenerkennung nutzen kann. Sicherlich ist es möglich, mit den Gesten (Daumen links / rechts) auch die Bewegungssteuerung durchzuführen, aber das halte ich für unkomfortabel für den Benutzer. Da könnte ich mir eher vorstellen, so wie Du es unter Pkt. 7 beschreibst, dass man durch eine Armbewegung das Instrument verschiebt, d.h. z.B. genau dahin zeigt, wo das Instrument hinsoll. Inwieweit dies über klassische Bildverarbeitung (z.B. farbige Handschuhe und Tracking der Farbe) oder über ein KI-Modell erfolgt, würde ich zunächst </w:t>
+      </w:r>
+      <w:proofErr w:type="gramStart"/>
+      <w:r>
+        <w:t>offen lassen</w:t>
+      </w:r>
+      <w:proofErr w:type="gramEnd"/>
+      <w:r>
+        <w:t>. Ich denke, es ist wichtig, wenn Du dazu noch recherchierst. Insofern würde ich noch nicht unbedingt auf Mediapipe setzen, zumal dies auch von der Plattform für das Videosystem abhängen wird. Auf der von Dir genannten Nvidia-Jetson Plattform hatten wir damit Probleme, aber auch das wäre zu evaluieren. Vielleicht ist die Unterstützung da inzwischen besser.</w:t>
       </w:r>
     </w:p>
     <w:p>
@@ -767,13 +921,29 @@
     </w:p>
     <w:p>
       <w:r>
-        <w:t>- Für die Kommunikation ist ROS sicher denkbar. Aber auch hier wird man ein bisschen auf die Plattform schauen müssen. Die Installation von ROS auf dem Jetson war nicht ganz so einfach. Möglicherweise ist MQTT die bessere Alternative: viel kleiner vom Overhead und für unsere Zwecke vermutlich ausreichend. MATLAB bietet auch MQTT-Unterstützung an. Ich würde das im Exposé noch nicht festlegen.</w:t>
+        <w:t xml:space="preserve">- Für die Kommunikation ist ROS sicher denkbar. Aber auch hier wird man ein bisschen auf die Plattform schauen müssen. Die Installation von ROS auf dem Jetson war nicht ganz so einfach. Möglicherweise ist MQTT die bessere Alternative: viel kleiner vom Overhead und für unsere Zwecke vermutlich ausreichend. MATLAB bietet auch MQTT-Unterstützung an. Ich würde das im </w:t>
+      </w:r>
+      <w:proofErr w:type="gramStart"/>
+      <w:r>
+        <w:t>Exposé</w:t>
+      </w:r>
+      <w:proofErr w:type="gramEnd"/>
+      <w:r>
+        <w:t xml:space="preserve"> noch nicht festlegen.</w:t>
       </w:r>
     </w:p>
     <w:p/>
     <w:p>
       <w:r>
-        <w:t>Ich schlage vor, wir treffen uns mal zu dritt in der Uni oder online und Du reduzierst dann das Exposés auf das Wesentliche:</w:t>
+        <w:t xml:space="preserve">Ich schlage vor, wir treffen uns mal zu dritt in der Uni oder online und Du reduzierst dann </w:t>
+      </w:r>
+      <w:proofErr w:type="gramStart"/>
+      <w:r>
+        <w:t>das Exposés</w:t>
+      </w:r>
+      <w:proofErr w:type="gramEnd"/>
+      <w:r>
+        <w:t xml:space="preserve"> auf das Wesentliche:</w:t>
       </w:r>
     </w:p>
     <w:p/>
@@ -851,7 +1021,15 @@
     <w:p>
       <w:r>
         <w:lastRenderedPageBreak/>
-        <w:t>mir gefällt das Exposé recht gut. Jonas, du hast verstanden, worum</w:t>
+        <w:t xml:space="preserve">mir gefällt das </w:t>
+      </w:r>
+      <w:proofErr w:type="gramStart"/>
+      <w:r>
+        <w:t>Exposé</w:t>
+      </w:r>
+      <w:proofErr w:type="gramEnd"/>
+      <w:r>
+        <w:t xml:space="preserve"> recht gut. Jonas, du hast verstanden, worum</w:t>
       </w:r>
     </w:p>
     <w:p>
@@ -908,8 +1086,13 @@
       </w:r>
     </w:p>
     <w:p>
-      <w:r>
-        <w:t>verwendest und dich auf die sinnvolle Anwendung von Mediapipe und</w:t>
+      <w:proofErr w:type="gramStart"/>
+      <w:r>
+        <w:t>verwendest</w:t>
+      </w:r>
+      <w:proofErr w:type="gramEnd"/>
+      <w:r>
+        <w:t xml:space="preserve"> und dich auf die sinnvolle Anwendung von Mediapipe und</w:t>
       </w:r>
     </w:p>
     <w:p>
@@ -931,8 +1114,13 @@
       </w:r>
     </w:p>
     <w:p>
-      <w:r>
-        <w:t>konzentrierst sowie auf die Einbettung in die teils schon</w:t>
+      <w:proofErr w:type="gramStart"/>
+      <w:r>
+        <w:t>konzentrierst</w:t>
+      </w:r>
+      <w:proofErr w:type="gramEnd"/>
+      <w:r>
+        <w:t xml:space="preserve"> sowie auf die Einbettung in die teils schon</w:t>
       </w:r>
     </w:p>
     <w:p>
@@ -957,7 +1145,15 @@
     </w:p>
     <w:p>
       <w:r>
-        <w:t>übrigens noch nicht. Das stimmt nicht ganz im Exposé.</w:t>
+        <w:t xml:space="preserve">übrigens noch nicht. Das stimmt nicht ganz im </w:t>
+      </w:r>
+      <w:proofErr w:type="gramStart"/>
+      <w:r>
+        <w:t>Exposé</w:t>
+      </w:r>
+      <w:proofErr w:type="gramEnd"/>
+      <w:r>
+        <w:t>.</w:t>
       </w:r>
     </w:p>
     <w:p>
@@ -985,8 +1181,13 @@
       </w:r>
       <w:proofErr w:type="spellEnd"/>
       <w:r>
-        <w:t>, das</w:t>
-      </w:r>
+        <w:t xml:space="preserve">, </w:t>
+      </w:r>
+      <w:proofErr w:type="gramStart"/>
+      <w:r>
+        <w:t>das</w:t>
+      </w:r>
+      <w:proofErr w:type="gramEnd"/>
     </w:p>
     <w:p>
       <w:r>
@@ -1135,17 +1336,38 @@
     </w:p>
     <w:p>
       <w:r>
-        <w:t>Gut, dann kümmern wir uns im März um den Rest vom Antrag. Ich</w:t>
-      </w:r>
-    </w:p>
-    <w:p>
-      <w:r>
-        <w:t>werde mich bis dahin etwas informieren und Aufgabenstellung +</w:t>
-      </w:r>
-    </w:p>
-    <w:p>
-      <w:r>
-        <w:t>mögliche Ansätze  niederschreiben.</w:t>
+        <w:t xml:space="preserve">Gut, dann kümmern wir uns im März um den Rest </w:t>
+      </w:r>
+      <w:proofErr w:type="gramStart"/>
+      <w:r>
+        <w:t>vom Antrag</w:t>
+      </w:r>
+      <w:proofErr w:type="gramEnd"/>
+      <w:r>
+        <w:t>. Ich</w:t>
+      </w:r>
+    </w:p>
+    <w:p>
+      <w:proofErr w:type="gramStart"/>
+      <w:r>
+        <w:t>werde</w:t>
+      </w:r>
+      <w:proofErr w:type="gramEnd"/>
+      <w:r>
+        <w:t xml:space="preserve"> mich bis dahin etwas informieren und Aufgabenstellung +</w:t>
+      </w:r>
+    </w:p>
+    <w:p>
+      <w:r>
+        <w:t xml:space="preserve">mögliche </w:t>
+      </w:r>
+      <w:proofErr w:type="gramStart"/>
+      <w:r>
+        <w:t>Ansätze  niederschreiben</w:t>
+      </w:r>
+      <w:proofErr w:type="gramEnd"/>
+      <w:r>
+        <w:t>.</w:t>
       </w:r>
     </w:p>
     <w:p>
@@ -1212,7 +1434,15 @@
     </w:p>
     <w:p>
       <w:r>
-        <w:t>Du kannst gerne die Aufgabenstellung als Exposé formulieren und</w:t>
+        <w:t xml:space="preserve">Du kannst gerne die Aufgabenstellung als </w:t>
+      </w:r>
+      <w:proofErr w:type="gramStart"/>
+      <w:r>
+        <w:t>Exposé</w:t>
+      </w:r>
+      <w:proofErr w:type="gramEnd"/>
+      <w:r>
+        <w:t xml:space="preserve"> formulieren und</w:t>
       </w:r>
     </w:p>
     <w:p>
@@ -1247,12 +1477,28 @@
     </w:p>
     <w:p>
       <w:r>
-        <w:t>sowieso erst am 1. Juni anfangen möchtest, sehe ich da kein</w:t>
-      </w:r>
-    </w:p>
-    <w:p>
-      <w:r>
-        <w:t>Problem. Dieses Datum trägst Du auch in der Anlage 2  ein; dann</w:t>
+        <w:t xml:space="preserve">sowieso erst am 1. Juni anfangen </w:t>
+      </w:r>
+      <w:proofErr w:type="gramStart"/>
+      <w:r>
+        <w:t>möchtest</w:t>
+      </w:r>
+      <w:proofErr w:type="gramEnd"/>
+      <w:r>
+        <w:t>, sehe ich da kein</w:t>
+      </w:r>
+    </w:p>
+    <w:p>
+      <w:r>
+        <w:t xml:space="preserve">Problem. Dieses Datum trägst Du auch in der Anlage </w:t>
+      </w:r>
+      <w:proofErr w:type="gramStart"/>
+      <w:r>
+        <w:t>2  ein</w:t>
+      </w:r>
+      <w:proofErr w:type="gramEnd"/>
+      <w:r>
+        <w:t>; dann</w:t>
       </w:r>
     </w:p>
     <w:p>
@@ -1297,7 +1543,15 @@
     </w:p>
     <w:p>
       <w:r>
-        <w:t>*Von:*Jonas &lt;</w:t>
+        <w:t>*</w:t>
+      </w:r>
+      <w:proofErr w:type="gramStart"/>
+      <w:r>
+        <w:t>Von:*</w:t>
+      </w:r>
+      <w:proofErr w:type="gramEnd"/>
+      <w:r>
+        <w:t>Jonas &lt;</w:t>
       </w:r>
       <w:hyperlink r:id="rId12" w:history="1">
         <w:r>
@@ -1313,36 +1567,84 @@
     </w:p>
     <w:p>
       <w:r>
-        <w:t>*Gesendet:* Donnerstag, 12. Februar 2026 00:10</w:t>
-      </w:r>
-    </w:p>
-    <w:p>
-      <w:r>
-        <w:t xml:space="preserve">*An:* </w:t>
+        <w:t>*</w:t>
+      </w:r>
+      <w:proofErr w:type="gramStart"/>
+      <w:r>
+        <w:t>Gesendet:*</w:t>
+      </w:r>
+      <w:proofErr w:type="gramEnd"/>
+      <w:r>
+        <w:t xml:space="preserve"> Donnerstag, 12. Februar 2026 00:10</w:t>
+      </w:r>
+    </w:p>
+    <w:p>
+      <w:pPr>
+        <w:rPr>
+          <w:lang w:val="en-US"/>
+        </w:rPr>
+      </w:pPr>
+      <w:r>
+        <w:rPr>
+          <w:lang w:val="en-US"/>
+        </w:rPr>
+        <w:t>*</w:t>
+      </w:r>
+      <w:proofErr w:type="gramStart"/>
+      <w:r>
+        <w:rPr>
+          <w:lang w:val="en-US"/>
+        </w:rPr>
+        <w:t>An:*</w:t>
+      </w:r>
+      <w:proofErr w:type="gramEnd"/>
+      <w:r>
+        <w:rPr>
+          <w:lang w:val="en-US"/>
+        </w:rPr>
+        <w:t xml:space="preserve"> </w:t>
       </w:r>
       <w:proofErr w:type="spellStart"/>
       <w:r>
+        <w:rPr>
+          <w:lang w:val="en-US"/>
+        </w:rPr>
         <w:t>Purat</w:t>
       </w:r>
       <w:proofErr w:type="spellEnd"/>
       <w:r>
+        <w:rPr>
+          <w:lang w:val="en-US"/>
+        </w:rPr>
         <w:t>, Marcus &lt;</w:t>
       </w:r>
       <w:hyperlink r:id="rId13" w:history="1">
         <w:r>
           <w:rPr>
             <w:rStyle w:val="Hyperlink"/>
+            <w:lang w:val="en-US"/>
           </w:rPr>
           <w:t>purat@bht-berlin.de</w:t>
         </w:r>
       </w:hyperlink>
       <w:r>
+        <w:rPr>
+          <w:lang w:val="en-US"/>
+        </w:rPr>
         <w:t>&gt;</w:t>
       </w:r>
     </w:p>
     <w:p>
       <w:r>
-        <w:t>*Cc:* Jakob, André &lt;</w:t>
+        <w:t>*</w:t>
+      </w:r>
+      <w:proofErr w:type="gramStart"/>
+      <w:r>
+        <w:t>Cc:*</w:t>
+      </w:r>
+      <w:proofErr w:type="gramEnd"/>
+      <w:r>
+        <w:t xml:space="preserve"> Jakob, André &lt;</w:t>
       </w:r>
       <w:hyperlink r:id="rId14" w:history="1">
         <w:r>
@@ -1358,7 +1660,15 @@
     </w:p>
     <w:p>
       <w:r>
-        <w:t>*Betreff:* Re: Masterarbeit jonas</w:t>
+        <w:t>*</w:t>
+      </w:r>
+      <w:proofErr w:type="gramStart"/>
+      <w:r>
+        <w:t>Betreff:*</w:t>
+      </w:r>
+      <w:proofErr w:type="gramEnd"/>
+      <w:r>
+        <w:t xml:space="preserve"> Re: Masterarbeit jonas</w:t>
       </w:r>
     </w:p>
     <w:p>
@@ -1378,8 +1688,13 @@
     </w:p>
     <w:p>
       <w:r>
-        <w:t>Ich könnte mein Verständnis über die Aufgabe als Exposé</w:t>
-      </w:r>
+        <w:t xml:space="preserve">Ich könnte mein Verständnis über die Aufgabe als </w:t>
+      </w:r>
+      <w:proofErr w:type="gramStart"/>
+      <w:r>
+        <w:t>Exposé</w:t>
+      </w:r>
+      <w:proofErr w:type="gramEnd"/>
     </w:p>
     <w:p>
       <w:r>
@@ -1417,12 +1732,28 @@
     </w:p>
     <w:p>
       <w:r>
-        <w:t>zum 25.02 ein Exposé an euch schicken. Ein gemeinsames</w:t>
-      </w:r>
-    </w:p>
-    <w:p>
-      <w:r>
-        <w:t>Treffen/Besprechen können wir von mir aus auch dann machen wenn</w:t>
+        <w:t xml:space="preserve">zum 25.02 ein </w:t>
+      </w:r>
+      <w:proofErr w:type="gramStart"/>
+      <w:r>
+        <w:t>Exposé</w:t>
+      </w:r>
+      <w:proofErr w:type="gramEnd"/>
+      <w:r>
+        <w:t xml:space="preserve"> an euch schicken. Ein gemeinsames</w:t>
+      </w:r>
+    </w:p>
+    <w:p>
+      <w:r>
+        <w:t xml:space="preserve">Treffen/Besprechen können wir von mir aus auch dann </w:t>
+      </w:r>
+      <w:proofErr w:type="gramStart"/>
+      <w:r>
+        <w:t>machen</w:t>
+      </w:r>
+      <w:proofErr w:type="gramEnd"/>
+      <w:r>
+        <w:t xml:space="preserve"> wenn</w:t>
       </w:r>
     </w:p>
     <w:p>
@@ -1472,7 +1803,15 @@
     </w:p>
     <w:p>
       <w:r>
-        <w:t>Wenn noch dagegen spricht,</w:t>
+        <w:t xml:space="preserve">Wenn noch </w:t>
+      </w:r>
+      <w:proofErr w:type="gramStart"/>
+      <w:r>
+        <w:t>dagegen spricht</w:t>
+      </w:r>
+      <w:proofErr w:type="gramEnd"/>
+      <w:r>
+        <w:t>,</w:t>
       </w:r>
     </w:p>
     <w:p>
@@ -1530,8 +1869,13 @@
         <w:t>    Am 11.02.2026 um 15:25 schrieb André Jakob &lt;</w:t>
       </w:r>
       <w:proofErr w:type="spellStart"/>
-      <w:r>
-        <w:t>andre.jakob@bht</w:t>
+      <w:proofErr w:type="gramStart"/>
+      <w:r>
+        <w:t>andre.jakob</w:t>
+      </w:r>
+      <w:proofErr w:type="gramEnd"/>
+      <w:r>
+        <w:t>@bht</w:t>
       </w:r>
       <w:proofErr w:type="spellEnd"/>
       <w:r>
@@ -1580,7 +1924,15 @@
     </w:p>
     <w:p>
       <w:r>
-        <w:t>    Ich werde mal was vorbereiten als Exposé.</w:t>
+        <w:t xml:space="preserve">    Ich werde mal was vorbereiten als </w:t>
+      </w:r>
+      <w:proofErr w:type="gramStart"/>
+      <w:r>
+        <w:t>Exposé</w:t>
+      </w:r>
+      <w:proofErr w:type="gramEnd"/>
+      <w:r>
+        <w:t>.</w:t>
       </w:r>
     </w:p>
     <w:p>
@@ -1793,29 +2145,24 @@
       </w:r>
     </w:p>
     <w:p>
+      <w:r>
+        <w:t>Jakob</w:t>
+      </w:r>
+    </w:p>
+    <w:p>
       <w:pPr>
         <w:rPr>
           <w:lang w:val="en-US"/>
         </w:rPr>
       </w:pPr>
       <w:r>
+        <w:t>        </w:t>
+      </w:r>
+      <w:r>
         <w:rPr>
           <w:lang w:val="en-US"/>
         </w:rPr>
-        <w:t>Jakob</w:t>
-      </w:r>
-    </w:p>
-    <w:p>
-      <w:pPr>
-        <w:rPr>
-          <w:lang w:val="en-US"/>
-        </w:rPr>
-      </w:pPr>
-      <w:r>
-        <w:rPr>
-          <w:lang w:val="en-US"/>
-        </w:rPr>
-        <w:t>        Manuel &lt;</w:t>
+        <w:t>Manuel &lt;</w:t>
       </w:r>
       <w:hyperlink r:id="rId17" w:history="1">
         <w:r>
@@ -2089,10 +2436,12 @@
         <w:t>            </w:t>
       </w:r>
       <w:proofErr w:type="spellStart"/>
+      <w:proofErr w:type="gramStart"/>
       <w:r>
         <w:t>eMail</w:t>
       </w:r>
       <w:proofErr w:type="spellEnd"/>
+      <w:proofErr w:type="gramEnd"/>
       <w:r>
         <w:t>-Empfang, aber nur über VPN. Das muss ich vorher</w:t>
       </w:r>
@@ -2109,7 +2458,15 @@
     </w:p>
     <w:p>
       <w:r>
-        <w:t>            Es wäre toll, wenn das mit dem Meeting mit dem</w:t>
+        <w:t xml:space="preserve">            Es wäre </w:t>
+      </w:r>
+      <w:proofErr w:type="gramStart"/>
+      <w:r>
+        <w:t>toll</w:t>
+      </w:r>
+      <w:proofErr w:type="gramEnd"/>
+      <w:r>
+        <w:t>, wenn das mit dem Meeting mit dem</w:t>
       </w:r>
     </w:p>
     <w:p>
@@ -2120,7 +2477,23 @@
     </w:p>
     <w:p>
       <w:r>
-        <w:t>            Jakob klappt. Das Exposé könnte ich ggf. noch vor</w:t>
+        <w:t xml:space="preserve">            Jakob </w:t>
+      </w:r>
+      <w:proofErr w:type="gramStart"/>
+      <w:r>
+        <w:t>klappt</w:t>
+      </w:r>
+      <w:proofErr w:type="gramEnd"/>
+      <w:r>
+        <w:t xml:space="preserve">. Das </w:t>
+      </w:r>
+      <w:proofErr w:type="gramStart"/>
+      <w:r>
+        <w:t>Exposé</w:t>
+      </w:r>
+      <w:proofErr w:type="gramEnd"/>
+      <w:r>
+        <w:t xml:space="preserve"> könnte ich ggf. noch vor</w:t>
       </w:r>
     </w:p>
     <w:p>
@@ -2135,7 +2508,23 @@
     </w:p>
     <w:p>
       <w:r>
-        <w:t>            Inhalt des Exposés habe ich ja bereits grob angerissen.</w:t>
+        <w:t xml:space="preserve">            Inhalt des </w:t>
+      </w:r>
+      <w:proofErr w:type="gramStart"/>
+      <w:r>
+        <w:t>Exposés</w:t>
+      </w:r>
+      <w:proofErr w:type="gramEnd"/>
+      <w:r>
+        <w:t xml:space="preserve"> habe ich </w:t>
+      </w:r>
+      <w:proofErr w:type="gramStart"/>
+      <w:r>
+        <w:t>ja bereits</w:t>
+      </w:r>
+      <w:proofErr w:type="gramEnd"/>
+      <w:r>
+        <w:t xml:space="preserve"> grob angerissen.</w:t>
       </w:r>
     </w:p>
     <w:p>
@@ -2295,7 +2684,21 @@
         <w:rPr>
           <w:lang w:val="en-US"/>
         </w:rPr>
-        <w:t>&lt;mailto:purat@bht-</w:t>
+        <w:t>&lt;</w:t>
+      </w:r>
+      <w:proofErr w:type="gramStart"/>
+      <w:r>
+        <w:rPr>
+          <w:lang w:val="en-US"/>
+        </w:rPr>
+        <w:t>mailto:purat</w:t>
+      </w:r>
+      <w:proofErr w:type="gramEnd"/>
+      <w:r>
+        <w:rPr>
+          <w:lang w:val="en-US"/>
+        </w:rPr>
+        <w:t>@bht-</w:t>
       </w:r>
     </w:p>
     <w:p>
@@ -2493,7 +2896,15 @@
     </w:p>
     <w:p>
       <w:r>
-        <w:t>            3 zustande kommt :°)</w:t>
+        <w:t xml:space="preserve">            3 zustande </w:t>
+      </w:r>
+      <w:proofErr w:type="gramStart"/>
+      <w:r>
+        <w:t>kommt :</w:t>
+      </w:r>
+      <w:proofErr w:type="gramEnd"/>
+      <w:r>
+        <w:t>°)</w:t>
       </w:r>
     </w:p>
     <w:p>
@@ -2527,7 +2938,15 @@
     </w:p>
     <w:p>
       <w:r>
-        <w:t>            Ich kann die BHT gut erreichen aber online würde auch</w:t>
+        <w:t xml:space="preserve">            Ich kann die BHT gut </w:t>
+      </w:r>
+      <w:proofErr w:type="gramStart"/>
+      <w:r>
+        <w:t>erreichen</w:t>
+      </w:r>
+      <w:proofErr w:type="gramEnd"/>
+      <w:r>
+        <w:t xml:space="preserve"> aber online würde auch</w:t>
       </w:r>
     </w:p>
     <w:p>
@@ -3007,9 +3426,11 @@
       </w:r>
     </w:p>
     <w:p>
+      <w:proofErr w:type="gramStart"/>
       <w:r>
         <w:t>möchtest</w:t>
       </w:r>
+      <w:proofErr w:type="gramEnd"/>
     </w:p>
     <w:p>
       <w:r>
@@ -3978,7 +4399,15 @@
     </w:p>
     <w:p>
       <w:r>
-        <w:t>                    Exposé formulieren, dann hättest Du alles,</w:t>
+        <w:t>                    </w:t>
+      </w:r>
+      <w:proofErr w:type="gramStart"/>
+      <w:r>
+        <w:t>Exposé</w:t>
+      </w:r>
+      <w:proofErr w:type="gramEnd"/>
+      <w:r>
+        <w:t xml:space="preserve"> formulieren, dann hättest Du alles,</w:t>
       </w:r>
     </w:p>
     <w:p>
@@ -4069,42 +4498,85 @@
       </w:r>
     </w:p>
     <w:p>
-      <w:r>
-        <w:t xml:space="preserve">                    An: </w:t>
+      <w:pPr>
+        <w:rPr>
+          <w:lang w:val="en-US"/>
+        </w:rPr>
+      </w:pPr>
+      <w:r>
+        <w:t>                    </w:t>
+      </w:r>
+      <w:r>
+        <w:rPr>
+          <w:lang w:val="en-US"/>
+        </w:rPr>
+        <w:t xml:space="preserve">An: </w:t>
       </w:r>
       <w:proofErr w:type="spellStart"/>
       <w:r>
+        <w:rPr>
+          <w:lang w:val="en-US"/>
+        </w:rPr>
         <w:t>Purat</w:t>
       </w:r>
       <w:proofErr w:type="spellEnd"/>
       <w:r>
+        <w:rPr>
+          <w:lang w:val="en-US"/>
+        </w:rPr>
         <w:t>, Marcus &lt;purat@bht-berlin.de</w:t>
       </w:r>
     </w:p>
     <w:p>
-      <w:r>
+      <w:pPr>
+        <w:rPr>
+          <w:lang w:val="en-US"/>
+        </w:rPr>
+      </w:pPr>
+      <w:r>
+        <w:rPr>
+          <w:lang w:val="en-US"/>
+        </w:rPr>
         <w:t>&lt;</w:t>
       </w:r>
       <w:hyperlink r:id="rId25" w:history="1">
         <w:r>
           <w:rPr>
             <w:rStyle w:val="Hyperlink"/>
+            <w:lang w:val="en-US"/>
           </w:rPr>
           <w:t>mailto:purat@bht-berlin.de</w:t>
         </w:r>
       </w:hyperlink>
       <w:r>
+        <w:rPr>
+          <w:lang w:val="en-US"/>
+        </w:rPr>
         <w:t>&gt;&gt;</w:t>
       </w:r>
     </w:p>
     <w:p>
-      <w:r>
-        <w:t> </w:t>
-      </w:r>
-    </w:p>
-    <w:p>
-      <w:r>
-        <w:t xml:space="preserve">                    Cc: </w:t>
+      <w:pPr>
+        <w:rPr>
+          <w:lang w:val="en-US"/>
+        </w:rPr>
+      </w:pPr>
+      <w:r>
+        <w:rPr>
+          <w:lang w:val="en-US"/>
+        </w:rPr>
+        <w:t> </w:t>
+      </w:r>
+    </w:p>
+    <w:p>
+      <w:r>
+        <w:rPr>
+          <w:lang w:val="en-US"/>
+        </w:rPr>
+        <w:t>                    </w:t>
+      </w:r>
+      <w:r>
+        <w:t xml:space="preserve">Cc: </w:t>
       </w:r>
       <w:hyperlink r:id="rId26" w:history="1">
         <w:r>
@@ -4248,7 +4720,15 @@
     </w:p>
     <w:p>
       <w:r>
-        <w:t>                    Das Thema macht mir den Anschein als hätte es</w:t>
+        <w:t xml:space="preserve">                    Das Thema macht mir den </w:t>
+      </w:r>
+      <w:proofErr w:type="gramStart"/>
+      <w:r>
+        <w:t>Anschein</w:t>
+      </w:r>
+      <w:proofErr w:type="gramEnd"/>
+      <w:r>
+        <w:t xml:space="preserve"> als hätte es</w:t>
       </w:r>
     </w:p>
     <w:p>
@@ -4288,7 +4768,15 @@
     </w:p>
     <w:p>
       <w:r>
-        <w:t>                    Und ich Programmiere gerne!</w:t>
+        <w:t xml:space="preserve">                    Und ich </w:t>
+      </w:r>
+      <w:proofErr w:type="gramStart"/>
+      <w:r>
+        <w:t>Programmiere</w:t>
+      </w:r>
+      <w:proofErr w:type="gramEnd"/>
+      <w:r>
+        <w:t xml:space="preserve"> gerne!</w:t>
       </w:r>
     </w:p>
     <w:p>
@@ -4346,12 +4834,28 @@
     </w:p>
     <w:p>
       <w:r>
-        <w:t>                    gerne Zeitnah anfangen mich mit dem Thema</w:t>
-      </w:r>
-    </w:p>
-    <w:p>
-      <w:r>
-        <w:t>                    auseinander zusetzen, wenn</w:t>
+        <w:t xml:space="preserve">                    gerne </w:t>
+      </w:r>
+      <w:proofErr w:type="gramStart"/>
+      <w:r>
+        <w:t>Zeitnah</w:t>
+      </w:r>
+      <w:proofErr w:type="gramEnd"/>
+      <w:r>
+        <w:t xml:space="preserve"> anfangen mich mit dem Thema</w:t>
+      </w:r>
+    </w:p>
+    <w:p>
+      <w:r>
+        <w:t>                    </w:t>
+      </w:r>
+      <w:proofErr w:type="gramStart"/>
+      <w:r>
+        <w:t>auseinander zusetzen</w:t>
+      </w:r>
+      <w:proofErr w:type="gramEnd"/>
+      <w:r>
+        <w:t>, wenn</w:t>
       </w:r>
     </w:p>
     <w:p>
@@ -4453,8 +4957,13 @@
     </w:p>
     <w:p>
       <w:r>
-        <w:t>                    Tage dazu besprechen ?</w:t>
-      </w:r>
+        <w:t xml:space="preserve">                    Tage dazu </w:t>
+      </w:r>
+      <w:proofErr w:type="gramStart"/>
+      <w:r>
+        <w:t>besprechen ?</w:t>
+      </w:r>
+      <w:proofErr w:type="gramEnd"/>
     </w:p>
     <w:p>
       <w:r>
@@ -4467,9 +4976,11 @@
       </w:r>
     </w:p>
     <w:p>
+      <w:proofErr w:type="gramStart"/>
       <w:r>
         <w:t>komme</w:t>
       </w:r>
+      <w:proofErr w:type="gramEnd"/>
     </w:p>
     <w:p>
       <w:r>
@@ -4493,8 +5004,13 @@
     </w:p>
     <w:p>
       <w:r>
-        <w:t>                    PS. ist es möglich über meine private Email</w:t>
-      </w:r>
+        <w:t xml:space="preserve">                    PS. ist es möglich über meine private </w:t>
+      </w:r>
+      <w:proofErr w:type="gramStart"/>
+      <w:r>
+        <w:t>Email</w:t>
+      </w:r>
+      <w:proofErr w:type="gramEnd"/>
     </w:p>
     <w:p>
       <w:r>
@@ -4514,6 +5030,401 @@
     <w:p>
       <w:r>
         <w:t>                    flexibler einsehen.</w:t>
+      </w:r>
+    </w:p>
+    <w:p>
+      <w:r>
+        <w:br w:type="page"/>
+      </w:r>
+    </w:p>
+    <w:p>
+      <w:r>
+        <w:rPr>
+          <w:rStyle w:val="berschrift1Zchn"/>
+        </w:rPr>
+        <w:lastRenderedPageBreak/>
+        <w:t>[</w:t>
+      </w:r>
+      <w:r>
+        <w:rPr>
+          <w:rStyle w:val="berschrift1Zchn"/>
+        </w:rPr>
+        <w:t>16.09.2026</w:t>
+      </w:r>
+      <w:r>
+        <w:rPr>
+          <w:rStyle w:val="berschrift1Zchn"/>
+        </w:rPr>
+        <w:t>]</w:t>
+      </w:r>
+      <w:r>
+        <w:br/>
+      </w:r>
+      <w:r>
+        <w:t>Hallo Jonas,</w:t>
+      </w:r>
+    </w:p>
+    <w:p>
+      <w:r>
+        <w:t> </w:t>
+      </w:r>
+    </w:p>
+    <w:p>
+      <w:r>
+        <w:t>sorry für mein verspätetes Feedback, aber es gab viele Baustellen in der letzten Woche. Daher konnte ich mich leider auch nur auf die beiden von Dir priorisierten Abschnitte fokussieren, aber das hilft hoffentlich trotzdem. Ist vielleicht ein bisschen lang, ich hoffe, Du verstehst es / das Wesentliche trotzdem.</w:t>
+      </w:r>
+    </w:p>
+    <w:p>
+      <w:r>
+        <w:t> </w:t>
+      </w:r>
+    </w:p>
+    <w:p>
+      <w:r>
+        <w:t>Schöne Grüße</w:t>
+      </w:r>
+    </w:p>
+    <w:p>
+      <w:r>
+        <w:t> </w:t>
+      </w:r>
+    </w:p>
+    <w:p>
+      <w:r>
+        <w:t>Marcus</w:t>
+      </w:r>
+    </w:p>
+    <w:p>
+      <w:r>
+        <w:t> </w:t>
+      </w:r>
+    </w:p>
+    <w:p>
+      <w:r>
+        <w:t>----</w:t>
+      </w:r>
+    </w:p>
+    <w:p>
+      <w:r>
+        <w:t> </w:t>
+      </w:r>
+    </w:p>
+    <w:p>
+      <w:r>
+        <w:t>Zitierform:</w:t>
+      </w:r>
+    </w:p>
+    <w:p>
+      <w:r>
+        <w:t> </w:t>
+      </w:r>
+    </w:p>
+    <w:p>
+      <w:r>
+        <w:t>Ich finde es tatsächlich ungewöhnlich, den Namen des Papers vor die Nummer zu stellen. Das macht das Lesen etwas umständlich. Außerdem ziehst du das auch nicht konsequent durch, manche Arbeiten werden nur mit ihrer Nummer angegeben. Insofern würde ich vorschlagen, du nutzt immer nur die Nummer. Zum Beispiel Seite 13: „In [1] wird der minimale Audiowinkel … untersucht.“ … „Etwas dichter an der Thematik der vorliegenden Arbeit wird in [2] der MAA beschrieben“. Alternativ kannst du die Autoren erwähnen, beispielsweise „Perrot und Saberi untersuchen in [1] den minimalen Audiowinkel …“</w:t>
+      </w:r>
+    </w:p>
+    <w:p>
+      <w:r>
+        <w:t> </w:t>
+      </w:r>
+    </w:p>
+    <w:p>
+      <w:r>
+        <w:t>Struktur:</w:t>
+      </w:r>
+    </w:p>
+    <w:p>
+      <w:r>
+        <w:t> </w:t>
+      </w:r>
+    </w:p>
+    <w:p>
+      <w:r>
+        <w:t>Generell: Die Arbeit sollte ein bisschen wie eine Sanduhr aufgebaut sein, sie beginnt breit (Einleitung), wird schmaler (Grundlagen), immer schmaler (Stand der Forschung), lässt nur noch ein paar Krümel durch (Konzept, Implementierung), und wird dann wieder breiter (Ergebnisse und deren Diskussion vor dem Hintergrund der Forschungsfrage und Problematik) und ganz breit (</w:t>
+      </w:r>
+      <w:proofErr w:type="spellStart"/>
+      <w:r>
+        <w:t>Resumee</w:t>
+      </w:r>
+      <w:proofErr w:type="spellEnd"/>
+      <w:r>
+        <w:t>, Ausblick).</w:t>
+      </w:r>
+    </w:p>
+    <w:p>
+      <w:r>
+        <w:t> </w:t>
+      </w:r>
+    </w:p>
+    <w:p>
+      <w:r>
+        <w:lastRenderedPageBreak/>
+        <w:t>Ich denke, dass Überblick und Projektziel in einem gemeinsamen Kapitel 1 „Einleitung“ diskutiert werden können. Das Kapitel beginnt mit der allgemeinen Einordnung (dem Überblick, der allgemeinen Problemstellung), diskutiert dann die Projektziele (Forschungsfrage) und endet mit einer kurzen Übersicht über das, was den Leser in den folgenden Kapiteln erwartet, also beispielsweise „Im Kapitel 3 werden die Grundlagen dieser Arbeit beschrieben.“</w:t>
+      </w:r>
+    </w:p>
+    <w:p>
+      <w:r>
+        <w:t> </w:t>
+      </w:r>
+    </w:p>
+    <w:p>
+      <w:r>
+        <w:t>Kapitel „Grundlagen“ müsste m.E. etwas angepasst werden.</w:t>
+      </w:r>
+    </w:p>
+    <w:p>
+      <w:r>
+        <w:t> </w:t>
+      </w:r>
+    </w:p>
+    <w:p>
+      <w:r>
+        <w:t xml:space="preserve">Generell geht es hier um </w:t>
+      </w:r>
+      <w:proofErr w:type="gramStart"/>
+      <w:r>
+        <w:t>eine relativ</w:t>
+      </w:r>
+      <w:proofErr w:type="gramEnd"/>
+      <w:r>
+        <w:t xml:space="preserve"> breite Diskussion von im Zusammenhang mit Deiner Arbeit wichtigen Grundlagen, d.h. Dingen, die man als Fachmann in diesem Gebiet eigentlich bereits kennt. Das Kapitel dient nur dazu, einen Einstieg zu bilden und die </w:t>
+      </w:r>
+      <w:proofErr w:type="spellStart"/>
+      <w:r>
+        <w:t>wesntlichen</w:t>
+      </w:r>
+      <w:proofErr w:type="spellEnd"/>
+      <w:r>
+        <w:t xml:space="preserve"> Grundlagen, soweit in Deiner Arbeit relevant, z.B. weil Du später darauf verweist, noch einmal kurz zu diskutieren. Ich würde hier nicht so viele Unterkapitel verwenden für die einzelnen morphologischen Transformationen. Dadurch bekommen Sie scheinbar zu viel Gewicht. Hier habe ich mir auch die Frage gestellt, inwieweit diese ganzen Operationen für deine Arbeit überhaupt eine wesentliche Rolle spielen. Ich bin mir auch nicht sicher, ob du die grundsätzlichen Methoden, die Mediapipe verwendet, an dieser Stelle nicht auch schon beschreiben solltest. Damit meine ich nicht Media Pipe </w:t>
+      </w:r>
+      <w:proofErr w:type="gramStart"/>
+      <w:r>
+        <w:t>selber</w:t>
+      </w:r>
+      <w:proofErr w:type="gramEnd"/>
+      <w:r>
+        <w:t xml:space="preserve"> als Tool, sondern die verwendeten Technologien. Gibt es da einen Übersichtsartikel, wie Mediapipe funktioniert? Letztlich handelt es sich dabei dann auch um Grundlagen. Aber auch hier gilt, beschreibe die Grundlagen nur insoweit, wie sie für Deine Arbeit relevant sind. Auch denke ich, dass ein paar Dinge aus Deinem Kapitel 4 „Stand der Forschung“ hier möglicherweise schon hineinkommen können, z.B. Mediapipe als Tool.</w:t>
+      </w:r>
+    </w:p>
+    <w:p>
+      <w:r>
+        <w:t> </w:t>
+      </w:r>
+    </w:p>
+    <w:p>
+      <w:r>
+        <w:t xml:space="preserve">Deine Kapitel „Stand der Forschung“ und „Implementierungen“ würde ich wiederum zusammenfassen zu einem Kapitel „Stand der Forschung“. In diesem Kapitel werden dann über die Grundlagen hinausgehende Techniken („Stand der Technik“) diskutiert als auch speziell für Deine Arbeit relevante (verwandte) Arbeiten beschrieben. Das beinhaltet alles, was ein normaler Fachmann auf dem Gebiet nicht unbedingt im Kopf hat. Hier kannst du dann auf die Grundlagen verweisen, die du im Kapitel Grundlagen beschrieben hast, also beispielsweise, „In [] wird </w:t>
+      </w:r>
+      <w:proofErr w:type="spellStart"/>
+      <w:r>
+        <w:t>MediaPipe</w:t>
+      </w:r>
+      <w:proofErr w:type="spellEnd"/>
+      <w:r>
+        <w:t xml:space="preserve"> benutzt.“. Ich denke außerdem, dass dieses Kapitel „Stand der Forschung“ mit einem Unterkapitel „Relevanz für die Arbeit“ abgeschlossen werden sollte, in denen dann kurz die Aspekte, die du in deinem eigenen Kapitel „Relevante Logiken</w:t>
+      </w:r>
+      <w:proofErr w:type="gramStart"/>
+      <w:r>
+        <w:t>“  drin</w:t>
+      </w:r>
+      <w:proofErr w:type="gramEnd"/>
+      <w:r>
+        <w:t xml:space="preserve"> hast, beschrieben werden sollten.</w:t>
+      </w:r>
+    </w:p>
+    <w:p>
+      <w:r>
+        <w:t> </w:t>
+      </w:r>
+    </w:p>
+    <w:p>
+      <w:r>
+        <w:lastRenderedPageBreak/>
+        <w:t>Das nächste Kapitel würde ich dann „Konzeption“ nennen und in dieses die Anforderungen aus Kapitel 6.1 sowie die Ansätze aus den Kapiteln 8 aufnehmen. Dieses Kapitel sollte dann mit der mit dem gewählten Lösungsansatz enden, beziehungsweise den gewählten Lösungsansätzen.</w:t>
+      </w:r>
+    </w:p>
+    <w:p>
+      <w:r>
+        <w:t> </w:t>
+      </w:r>
+    </w:p>
+    <w:p>
+      <w:r>
+        <w:t>Das nächste Kapitel würde dann die „Implementierung“ beziehungsweise „Umsetzung“ diskutieren. Hier käme hinein die Wahl der HW und Software sowie dein Kapitel „Implementierung“.</w:t>
+      </w:r>
+    </w:p>
+    <w:p>
+      <w:r>
+        <w:t> </w:t>
+      </w:r>
+    </w:p>
+    <w:p>
+      <w:r>
+        <w:t>Das letzte Kapitel wäre dann für die „Ergebnisse“, d.h. hier diskutierst du Messungen im Hinblick auf die Forschungsfrage, die du am Anfang gestellt hast, beziehungsweise das Projektziel und die Anforderungen, die du in der Konzeption genannt hast.</w:t>
+      </w:r>
+    </w:p>
+    <w:p>
+      <w:r>
+        <w:t> </w:t>
+      </w:r>
+    </w:p>
+    <w:p>
+      <w:r>
+        <w:t>Ein abschließendes Kapitel würde dann das Resümee sein.</w:t>
+      </w:r>
+    </w:p>
+    <w:p>
+      <w:r>
+        <w:t> </w:t>
+      </w:r>
+    </w:p>
+    <w:p>
+      <w:r>
+        <w:t>Die Bedienungsanleitung sollte bitte nur im Anex auftauchen, also im Anhang.</w:t>
+      </w:r>
+    </w:p>
+    <w:p>
+      <w:r>
+        <w:t> </w:t>
+      </w:r>
+    </w:p>
+    <w:p>
+      <w:r>
+        <w:t>Du hast ein „Verzeichnis spezieller Begriffe“ angelegt. Dieses würde ich Glossar nennen und ebenfalls (so ist es eher üblich) ans Ende der Arbeit stellen, hinter das Literaturverzeichnis. Dafür sollte aber an den Anfang also vor der Einleitung noch ein Abkürzungsverzeichnis.</w:t>
+      </w:r>
+    </w:p>
+    <w:p>
+      <w:r>
+        <w:t> </w:t>
+      </w:r>
+    </w:p>
+    <w:p>
+      <w:r>
+        <w:t>Kapitel 4.4:</w:t>
+      </w:r>
+    </w:p>
+    <w:p>
+      <w:r>
+        <w:t> </w:t>
+      </w:r>
+    </w:p>
+    <w:p>
+      <w:r>
+        <w:t xml:space="preserve">Ich denke, und das scheint sich auch auf die anderen Kapitel zu beziehen, dass du das Thema hier zu breit diskutierst. Gut </w:t>
+      </w:r>
+      <w:proofErr w:type="gramStart"/>
+      <w:r>
+        <w:t>ist</w:t>
+      </w:r>
+      <w:proofErr w:type="gramEnd"/>
+      <w:r>
+        <w:t xml:space="preserve"> der erste Absatz sowie der zweite Absatz mit den Anwendungen. Viele der nächsten Abschnitte diskutieren das dann aber zu tief. Du musst nicht genau erklären, was diese Anwendung genau bedeuten und wie dynamische Gesten als Kommandos verwendet werden können. Das ist für Deine Arbeit nicht relevant. Ich denke hier lassen sich viele Sachen in einem kurzen Absatz </w:t>
+      </w:r>
+      <w:proofErr w:type="gramStart"/>
+      <w:r>
+        <w:t>zusammenfassen,  falls</w:t>
+      </w:r>
+      <w:proofErr w:type="gramEnd"/>
+      <w:r>
+        <w:t xml:space="preserve"> dieser überhaupt nötig ist.</w:t>
+      </w:r>
+    </w:p>
+    <w:p>
+      <w:r>
+        <w:t> </w:t>
+      </w:r>
+    </w:p>
+    <w:p>
+      <w:r>
+        <w:t xml:space="preserve">Am Ende des Kapitels gehst du wieder auf die vorliegende Arbeit ein, in dem du sagst, es soll die Raumrichtung von Soundquellen bestimmt werden. Dann kommt allerdings </w:t>
+      </w:r>
+      <w:r>
+        <w:lastRenderedPageBreak/>
+        <w:t xml:space="preserve">wieder ein Verweis auf ein Paper [8], welches aus meiner Sicht an dieser Stelle gar nicht passt, weil das erst zu „verwandten Arbeiten“ gehört, d.h. detaillierten Vorschlägen, wie man Gesteninteraktion betreiben kann, und welches für Dich eine hohe Relevanz hat. Und letztlich beschreibst Du wieder, wie man Ideen aus dieser Arbeit in dein Konzept übernehmen kann. Das wirkt ein bisschen unstrukturiert. Das Kapitel „Grundlagen“ (oder vielleicht bereits die Einleitung) sollte allgemein das Thema Gestenerkennung (Gestensteuerung in der Robotik) und was es in diesem ganzen Kontext </w:t>
+      </w:r>
+      <w:proofErr w:type="gramStart"/>
+      <w:r>
+        <w:t>gibt</w:t>
+      </w:r>
+      <w:proofErr w:type="gramEnd"/>
+      <w:r>
+        <w:t xml:space="preserve"> diskutieren, ohne zu viele Details. Die verwandten Arbeiten (also konkrete Arbeiten mit hoher Relevanz für Deine Arbeit) im Teil Stand der Forschung gehen (dazu gehört [8]) dann wieder tiefer in die Nähe deiner Arbeit und dann wirst du abschließend in diesem Kapitel die Relevanz </w:t>
+      </w:r>
+      <w:proofErr w:type="gramStart"/>
+      <w:r>
+        <w:t>der verschiedenen Paper</w:t>
+      </w:r>
+      <w:proofErr w:type="gramEnd"/>
+      <w:r>
+        <w:t xml:space="preserve"> in Bezug auf deine Arbeit diskutieren, sonst springt man bei meinem Lesen zu sehr hin und her</w:t>
+      </w:r>
+    </w:p>
+    <w:p>
+      <w:r>
+        <w:t> </w:t>
+      </w:r>
+    </w:p>
+    <w:p>
+      <w:r>
+        <w:t>Kapitel 9.1.5</w:t>
+      </w:r>
+    </w:p>
+    <w:p>
+      <w:r>
+        <w:t> </w:t>
+      </w:r>
+    </w:p>
+    <w:p>
+      <w:r>
+        <w:t>Ich denke, auch, dieses Kapitel ist ein wenig lang. Es fängt damit an, dass du die verschiedenen Formate nennst, dann aber sagst, dass das gemacht wurde, bevor die Funktionsweise der Gestenerkennung entwickelt wurde, wodurch erst klar wird, warum du zwei verschiedene Formate ursprünglich genommen hast. Diese Detailtiefe ist für die Arbeit nicht relevant und verwirrt mehr.</w:t>
+      </w:r>
+    </w:p>
+    <w:p>
+      <w:r>
+        <w:t>Im Grunde genommen genügt es, wenn du an dieser Stelle nur die Ergebnisse angibst und vorher noch mal den Test kurz beschreibst, d.h. du sagst du hast fünf Videos benutzt, in denen die Frames händisch als offen oder geschlossene Geste markiert werden. Dazu bringst du am besten noch zwei Bilder zur Visualisierung. Dann sagst du, welches Kriterium du zur Überprüfung verwendet hast. Der Begriff „Right-Rate Quote“ kommt mir komisch vor, sagt man hierzu nicht „</w:t>
+      </w:r>
+      <w:proofErr w:type="spellStart"/>
+      <w:r>
+        <w:t>true</w:t>
+      </w:r>
+      <w:proofErr w:type="spellEnd"/>
+      <w:r>
+        <w:t xml:space="preserve"> positiv“ beziehungsweise „</w:t>
+      </w:r>
+      <w:proofErr w:type="spellStart"/>
+      <w:r>
+        <w:t>true</w:t>
+      </w:r>
+      <w:proofErr w:type="spellEnd"/>
+      <w:r>
+        <w:t xml:space="preserve"> negative“, und ist deine „Right-Rate Quote“ nicht einfach die „</w:t>
+      </w:r>
+      <w:proofErr w:type="spellStart"/>
+      <w:r>
+        <w:t>Accuracy</w:t>
+      </w:r>
+      <w:proofErr w:type="spellEnd"/>
+      <w:r>
+        <w:t>“? Als Ergebnis gibst du dann noch an, dass sich mit der Apertur-Methode mit Schwellwert 60 und 70 die besten Ergebnisse ergaben, wobei natürlich die Schwellenwerte vorher erklärt werden müssen und die Apertur-Methode auch, aber das passiert ja wahrscheinlich vorher.</w:t>
+      </w:r>
+    </w:p>
+    <w:p>
+      <w:r>
+        <w:t> </w:t>
+      </w:r>
+    </w:p>
+    <w:p>
+      <w:r>
+        <w:t xml:space="preserve">Der letzte Absatz ist wieder wichtig, weil er verdeutlicht, dass dies nicht eine echte </w:t>
+      </w:r>
+      <w:proofErr w:type="spellStart"/>
+      <w:r>
+        <w:t>Accuracy</w:t>
+      </w:r>
+      <w:proofErr w:type="spellEnd"/>
+      <w:r>
+        <w:t xml:space="preserve"> aufgrund eines großen Datensatz ist, sondern nur zur Indikation dient, welche Methode du gewählt hast.</w:t>
       </w:r>
     </w:p>
     <w:p/>

</xml_diff>